<commit_message>
feat(relaunch §0.3-0.5, §0.8): analytics funnel + claims gate over campaign copy
§0.5 Analytics — the relaunch was going to run blind. Wire Vercel Web
Analytics with three goal events and first-touch UTM attribution, so
every event answers "which post drove this?" not just "how many?":
  signup             — profile row insert (new account, Google + email)
  first_analysis_run — lifetime counter still 0 when the run is charged
  purchase           — Stripe session_id return, URL stripped after
trackOnce() de-dupes the two milestones per browser; track() never
throws into a user flow.

§0.3 Bridge example pinned to 40% of OCF everywhere (X/FB said 60%).
§0.4 "MacroLens" → "Macro Lens" in the blitz heartbeat.
§0.8 check:claims now also gates the relaunch campaign copy that
publishes outside the app; meta-docs excluded (they quote the bans).

Still founder-gated: §0.2 NVO figure, §0.1 voice pass, §0.6/§0.7 art.

Co-Authored-By: Claude Opus 4.8 <noreply@anthropic.com>
</commit_message>
<xml_diff>
--- a/docs/relaunch/MASTER-RELAUNCH-BLITZ-PACK.docx
+++ b/docs/relaunch/MASTER-RELAUNCH-BLITZ-PACK.docx
@@ -583,7 +583,7 @@
         <w:pStyle w:val="Heading2"/>
       </w:pPr>
       <w:r>
-        <w:t>2. MacroLens</w:t>
+        <w:t>2. Macro Lens</w:t>
       </w:r>
     </w:p>
     <w:p>
@@ -591,7 +591,7 @@
         <w:rPr>
           <w:b w:val="0"/>
         </w:rPr>
-        <w:t>HEARTBEAT: Before you check your portfolio, check the weather. MacroLens: the plain-English daily macro brief.</w:t>
+        <w:t>HEARTBEAT: Before you check your portfolio, check the weather. Macro Lens: the plain-English daily macro brief.</w:t>
       </w:r>
     </w:p>
     <w:p>

</xml_diff>